<commit_message>
Project documentation and Amsh Shrestha Individual timesheel updates
</commit_message>
<xml_diff>
--- a/AmshShrestha_S394695/Project_Documentation.docx
+++ b/AmshShrestha_S394695/Project_Documentation.docx
@@ -2,13 +2,12 @@
 <file path=word/document.xml><?xml version="1.0" encoding="utf-8"?>
 <w:document xmlns:w="http://schemas.openxmlformats.org/wordprocessingml/2006/main" xmlns:m="http://schemas.openxmlformats.org/officeDocument/2006/math" xmlns:r="http://schemas.openxmlformats.org/officeDocument/2006/relationships" xmlns:o="urn:schemas-microsoft-com:office:office" xmlns:v="urn:schemas-microsoft-com:vml" xmlns:w10="urn:schemas-microsoft-com:office:word" xmlns:a="http://schemas.openxmlformats.org/drawingml/2006/main" xmlns:pic="http://schemas.openxmlformats.org/drawingml/2006/picture" xmlns:wp="http://schemas.openxmlformats.org/drawingml/2006/wordprocessingDrawing">
   <w:body>
-    <w:bookmarkStart w:id="23" w:name="splitsync-project-documentation"/>
     <w:p>
       <w:pPr>
         <w:pStyle w:val="Heading1"/>
       </w:pPr>
       <w:r>
-        <w:t xml:space="preserve">SplitSync — Project Documentation</w:t>
+        <w:t xml:space="preserve">SplitSync: Project Documentation</w:t>
       </w:r>
     </w:p>
     <w:p>
@@ -20,128 +19,37 @@
           <w:i/>
           <w:iCs/>
         </w:rPr>
-        <w:t xml:space="preserve">Amsh Shrestha (S394695), Developer / Report Writer. Documentation of the system as built,</w:t>
-      </w:r>
-      <w:r>
-        <w:rPr>
+        <w:t xml:space="preserve">Amsh Shrestha (S394695), Developer / Report Writer. This documents the system as it's built right now (24 Sept 2026). The Introduction, Aim, Objectives and Scope come from our SRS. From System Architecture onwards it's based on the actual code in </w:t>
+      </w:r>
+      <w:r>
+        <w:rPr>
+          <w:rStyle w:val="VerbatimChar"/>
           <w:i/>
           <w:iCs/>
         </w:rPr>
-        <w:t xml:space="preserve"> </w:t>
+        <w:t xml:space="preserve">splitsync/server</w:t>
       </w:r>
       <w:r>
         <w:rPr>
           <w:i/>
           <w:iCs/>
         </w:rPr>
-        <w:t xml:space="preserve">as of 15 Sept 2026. Introduction/Aim/Objectives/Scope drawn from the team’s SRS; everything</w:t>
-      </w:r>
-      <w:r>
-        <w:rPr>
+        <w:t xml:space="preserve"> and </w:t>
+      </w:r>
+      <w:r>
+        <w:rPr>
+          <w:rStyle w:val="VerbatimChar"/>
           <w:i/>
           <w:iCs/>
         </w:rPr>
-        <w:t xml:space="preserve"> </w:t>
+        <w:t xml:space="preserve">splitsync/client</w:t>
       </w:r>
       <w:r>
         <w:rPr>
           <w:i/>
           <w:iCs/>
         </w:rPr>
-        <w:t xml:space="preserve">from</w:t>
-      </w:r>
-      <w:r>
-        <w:rPr>
-          <w:i/>
-          <w:iCs/>
-        </w:rPr>
-        <w:t xml:space="preserve"> </w:t>
-      </w:r>
-      <w:r>
-        <w:rPr>
-          <w:i/>
-          <w:iCs/>
-        </w:rPr>
-        <w:t xml:space="preserve">“System Architecture”</w:t>
-      </w:r>
-      <w:r>
-        <w:rPr>
-          <w:i/>
-          <w:iCs/>
-        </w:rPr>
-        <w:t xml:space="preserve"> </w:t>
-      </w:r>
-      <w:r>
-        <w:rPr>
-          <w:i/>
-          <w:iCs/>
-        </w:rPr>
-        <w:t xml:space="preserve">onward is grounded directly in the current codebase</w:t>
-      </w:r>
-      <w:r>
-        <w:rPr>
-          <w:i/>
-          <w:iCs/>
-        </w:rPr>
-        <w:t xml:space="preserve"> </w:t>
-      </w:r>
-      <w:r>
-        <w:rPr>
-          <w:i/>
-          <w:iCs/>
-        </w:rPr>
-        <w:t xml:space="preserve">(</w:t>
-      </w:r>
-      <w:r>
-        <w:rPr>
-          <w:rStyle w:val="VerbatimChar"/>
-          <w:i/>
-          <w:iCs/>
-        </w:rPr>
-        <w:t xml:space="preserve">splitsync/server</w:t>
-      </w:r>
-      <w:r>
-        <w:rPr>
-          <w:i/>
-          <w:iCs/>
-        </w:rPr>
-        <w:t xml:space="preserve">,</w:t>
-      </w:r>
-      <w:r>
-        <w:rPr>
-          <w:i/>
-          <w:iCs/>
-        </w:rPr>
-        <w:t xml:space="preserve"> </w:t>
-      </w:r>
-      <w:r>
-        <w:rPr>
-          <w:rStyle w:val="VerbatimChar"/>
-          <w:i/>
-          <w:iCs/>
-        </w:rPr>
-        <w:t xml:space="preserve">splitsync/client</w:t>
-      </w:r>
-      <w:r>
-        <w:rPr>
-          <w:i/>
-          <w:iCs/>
-        </w:rPr>
-        <w:t xml:space="preserve">), not the SRS’s plans, so gaps between the two are</w:t>
-      </w:r>
-      <w:r>
-        <w:rPr>
-          <w:i/>
-          <w:iCs/>
-        </w:rPr>
-        <w:t xml:space="preserve"> </w:t>
-      </w:r>
-      <w:r>
-        <w:rPr>
-          <w:i/>
-          <w:iCs/>
-        </w:rPr>
-        <w:t xml:space="preserve">called out explicitly rather than glossed over.</w:t>
+        <w:t xml:space="preserve">, so where the code is different from the SRS I've pointed it out.</w:t>
       </w:r>
     </w:p>
     <w:p>
@@ -153,7 +61,7 @@
         </w:numPr>
       </w:pPr>
       <w:r>
-        <w:t xml:space="preserve">Repo: https://github.com/ams-sth/splitsync</w:t>
+        <w:t xml:space="preserve">Repo: https://github.com/ams-sth/group01_software_project</w:t>
       </w:r>
     </w:p>
     <w:p>
@@ -168,7 +76,6 @@
         <w:t xml:space="preserve">Trello: https://trello.com/b/11CVnhSH/prt585-software-engineering-practice</w:t>
       </w:r>
     </w:p>
-    <w:bookmarkStart w:id="9" w:name="introduction"/>
     <w:p>
       <w:pPr>
         <w:pStyle w:val="Heading2"/>
@@ -182,29 +89,9 @@
         <w:pStyle w:val="FirstParagraph"/>
       </w:pPr>
       <w:r>
-        <w:t xml:space="preserve">SplitSync is a group-based expense-splitting Progressive Web Application (PWA). It lets</w:t>
-      </w:r>
-      <w:r>
-        <w:t xml:space="preserve"> </w:t>
-      </w:r>
-      <w:r>
-        <w:t xml:space="preserve">groups of users — roommates, travel groups, and similar — track, split, and settle shared</w:t>
-      </w:r>
-      <w:r>
-        <w:t xml:space="preserve"> </w:t>
-      </w:r>
-      <w:r>
-        <w:t xml:space="preserve">expenses in a synchronised, group-based environment. It is explicitly group-oriented: it does</w:t>
-      </w:r>
-      <w:r>
-        <w:t xml:space="preserve"> </w:t>
-      </w:r>
-      <w:r>
-        <w:t xml:space="preserve">not support individual/personal expense tracking outside a group context.</w:t>
-      </w:r>
-    </w:p>
-    <w:bookmarkEnd w:id="9"/>
-    <w:bookmarkStart w:id="10" w:name="aim"/>
+        <w:t xml:space="preserve">SplitSync is a group-based expense-splitting Progressive Web Application (PWA). It lets groups of people (like roommates or travel groups) track, split, and settle shared expenses in a synchronised, group-based environment. It is explicitly group-oriented: it does not support individual/personal expense tracking outside a group context.</w:t>
+      </w:r>
+    </w:p>
     <w:p>
       <w:pPr>
         <w:pStyle w:val="Heading2"/>
@@ -218,23 +105,9 @@
         <w:pStyle w:val="FirstParagraph"/>
       </w:pPr>
       <w:r>
-        <w:t xml:space="preserve">To build a mobile-first, web-accessible application that removes the friction and ambiguity</w:t>
-      </w:r>
-      <w:r>
-        <w:t xml:space="preserve"> </w:t>
-      </w:r>
-      <w:r>
-        <w:t xml:space="preserve">of splitting shared costs within a group, and makes it clear at any time who owes what to</w:t>
-      </w:r>
-      <w:r>
-        <w:t xml:space="preserve"> </w:t>
-      </w:r>
-      <w:r>
-        <w:t xml:space="preserve">whom.</w:t>
-      </w:r>
-    </w:p>
-    <w:bookmarkEnd w:id="10"/>
-    <w:bookmarkStart w:id="11" w:name="objectives"/>
+        <w:t xml:space="preserve">To build a mobile-first, web-accessible application that removes the friction and ambiguity of splitting shared costs within a group, and makes it clear at any time who owes what to whom.</w:t>
+      </w:r>
+    </w:p>
     <w:p>
       <w:pPr>
         <w:pStyle w:val="Heading2"/>
@@ -264,13 +137,7 @@
         </w:numPr>
       </w:pPr>
       <w:r>
-        <w:t xml:space="preserve">Support recording expenses split three ways: equally, unequally (custom amounts), or by</w:t>
-      </w:r>
-      <w:r>
-        <w:t xml:space="preserve"> </w:t>
-      </w:r>
-      <w:r>
-        <w:t xml:space="preserve">percentage.</w:t>
+        <w:t xml:space="preserve">Support recording expenses split three ways: equally, unequally (custom amounts), or by percentage.</w:t>
       </w:r>
     </w:p>
     <w:p>
@@ -282,13 +149,7 @@
         </w:numPr>
       </w:pPr>
       <w:r>
-        <w:t xml:space="preserve">Track and surface running balances (who owes whom) per group, without processing actual</w:t>
-      </w:r>
-      <w:r>
-        <w:t xml:space="preserve"> </w:t>
-      </w:r>
-      <w:r>
-        <w:t xml:space="preserve">payments.</w:t>
+        <w:t xml:space="preserve">Track and surface running balances (who owes whom) per group, without processing actual payments.</w:t>
       </w:r>
     </w:p>
     <w:p>
@@ -315,8 +176,6 @@
         <w:t xml:space="preserve">Deliver it as a responsive PWA usable on both desktop and mobile browsers.</w:t>
       </w:r>
     </w:p>
-    <w:bookmarkEnd w:id="11"/>
-    <w:bookmarkStart w:id="12" w:name="scope"/>
     <w:p>
       <w:pPr>
         <w:pStyle w:val="Heading2"/>
@@ -337,28 +196,7 @@
         <w:t xml:space="preserve">In scope (per SRS):</w:t>
       </w:r>
       <w:r>
-        <w:t xml:space="preserve"> </w:t>
-      </w:r>
-      <w:r>
-        <w:t xml:space="preserve">group creation/membership management; expense entry, editing,</w:t>
-      </w:r>
-      <w:r>
-        <w:t xml:space="preserve"> </w:t>
-      </w:r>
-      <w:r>
-        <w:t xml:space="preserve">viewing, removal; equal/unequal/percentage split configuration; receipt/photo attachment;</w:t>
-      </w:r>
-      <w:r>
-        <w:t xml:space="preserve"> </w:t>
-      </w:r>
-      <w:r>
-        <w:t xml:space="preserve">expense history; balance visibility; settlement recording; email notifications for unpaid</w:t>
-      </w:r>
-      <w:r>
-        <w:t xml:space="preserve"> </w:t>
-      </w:r>
-      <w:r>
-        <w:t xml:space="preserve">balances; recurring expenses; group activity log.</w:t>
+        <w:t xml:space="preserve"> group creation/membership management; expense entry, editing, viewing, removal; equal/unequal/percentage split configuration; receipt/photo attachment; expense history; balance visibility; settlement recording; email notifications for unpaid balances; recurring expenses; group activity log.</w:t>
       </w:r>
     </w:p>
     <w:p>
@@ -373,26 +211,9 @@
         <w:t xml:space="preserve">Out of scope (per SRS):</w:t>
       </w:r>
       <w:r>
-        <w:t xml:space="preserve"> </w:t>
-      </w:r>
-      <w:r>
-        <w:t xml:space="preserve">real-time in-app payment processing; removing a member with an</w:t>
-      </w:r>
-      <w:r>
-        <w:t xml:space="preserve"> </w:t>
-      </w:r>
-      <w:r>
-        <w:t xml:space="preserve">unsettled balance; multi-currency support; a native mobile app (PWA only); debt</w:t>
-      </w:r>
-      <w:r>
-        <w:t xml:space="preserve"> </w:t>
-      </w:r>
-      <w:r>
-        <w:t xml:space="preserve">simplification/netting.</w:t>
-      </w:r>
-    </w:p>
-    <w:bookmarkEnd w:id="12"/>
-    <w:bookmarkStart w:id="13" w:name="features-planned-vs.-implemented"/>
+        <w:t xml:space="preserve"> real-time in-app payment processing; removing a member with an unsettled balance; multi-currency support; a native mobile app (PWA only); debt simplification/netting.</w:t>
+      </w:r>
+    </w:p>
     <w:p>
       <w:pPr>
         <w:pStyle w:val="Heading2"/>
@@ -471,7 +292,7 @@
               <w:pStyle w:val="Compact"/>
             </w:pPr>
             <w:r>
-              <w:t xml:space="preserve">Account deletion (blocked if unpaid balance / owns a group)</w:t>
+              <w:t xml:space="preserve">Account deletion (blocked if you still own a group)</w:t>
             </w:r>
           </w:p>
         </w:tc>
@@ -495,7 +316,7 @@
               <w:pStyle w:val="Compact"/>
             </w:pPr>
             <w:r>
-              <w:t xml:space="preserve">Group create/rename/delete (creator-only)</w:t>
+              <w:t xml:space="preserve">Group create/rename/delete (creator only)</w:t>
             </w:r>
           </w:p>
         </w:tc>
@@ -615,7 +436,7 @@
               <w:pStyle w:val="Compact"/>
             </w:pPr>
             <w:r>
-              <w:t xml:space="preserve">Receipt/photo attachment on expenses</w:t>
+              <w:t xml:space="preserve">Expense editing/removal</w:t>
             </w:r>
           </w:p>
         </w:tc>
@@ -626,7 +447,7 @@
               <w:pStyle w:val="Compact"/>
             </w:pPr>
             <w:r>
-              <w:t xml:space="preserve">Not yet implemented</w:t>
+              <w:t xml:space="preserve">Implemented (Week 08, payer only)</w:t>
             </w:r>
           </w:p>
         </w:tc>
@@ -639,7 +460,7 @@
               <w:pStyle w:val="Compact"/>
             </w:pPr>
             <w:r>
-              <w:t xml:space="preserve">Email notifications for unpaid balances</w:t>
+              <w:t xml:space="preserve">Receipt/photo attachment on expenses</w:t>
             </w:r>
           </w:p>
         </w:tc>
@@ -650,7 +471,31 @@
               <w:pStyle w:val="Compact"/>
             </w:pPr>
             <w:r>
-              <w:t xml:space="preserve">Not yet implemented</w:t>
+              <w:t xml:space="preserve">Implemented (Week 09)</w:t>
+            </w:r>
+          </w:p>
+        </w:tc>
+      </w:tr>
+      <w:tr>
+        <w:tc>
+          <w:tcPr/>
+          <w:p>
+            <w:pPr>
+              <w:pStyle w:val="Compact"/>
+            </w:pPr>
+            <w:r>
+              <w:t xml:space="preserve">Notifications</w:t>
+            </w:r>
+          </w:p>
+        </w:tc>
+        <w:tc>
+          <w:tcPr/>
+          <w:p>
+            <w:pPr>
+              <w:pStyle w:val="Compact"/>
+            </w:pPr>
+            <w:r>
+              <w:t xml:space="preserve">In-app notifications implemented (Week 08). Email notifications for unpaid balances not built</w:t>
             </w:r>
           </w:p>
         </w:tc>
@@ -674,7 +519,7 @@
               <w:pStyle w:val="Compact"/>
             </w:pPr>
             <w:r>
-              <w:t xml:space="preserve">Not yet implemented</w:t>
+              <w:t xml:space="preserve">Not implemented</w:t>
             </w:r>
           </w:p>
         </w:tc>
@@ -698,38 +543,12 @@
               <w:pStyle w:val="Compact"/>
             </w:pPr>
             <w:r>
-              <w:t xml:space="preserve">Not yet implemented</w:t>
-            </w:r>
-          </w:p>
-        </w:tc>
-      </w:tr>
-      <w:tr>
-        <w:tc>
-          <w:tcPr/>
-          <w:p>
-            <w:pPr>
-              <w:pStyle w:val="Compact"/>
-            </w:pPr>
-            <w:r>
-              <w:t xml:space="preserve">Expense editing/removal</w:t>
-            </w:r>
-          </w:p>
-        </w:tc>
-        <w:tc>
-          <w:tcPr/>
-          <w:p>
-            <w:pPr>
-              <w:pStyle w:val="Compact"/>
-            </w:pPr>
-            <w:r>
-              <w:t xml:space="preserve">Not yet implemented (create + view only)</w:t>
+              <w:t xml:space="preserve">Not implemented, the Transactions tab shows expense and settlement history instead</w:t>
             </w:r>
           </w:p>
         </w:tc>
       </w:tr>
     </w:tbl>
-    <w:bookmarkEnd w:id="13"/>
-    <w:bookmarkStart w:id="14" w:name="system-architecture"/>
     <w:p>
       <w:pPr>
         <w:pStyle w:val="Heading2"/>
@@ -754,10 +573,7 @@
         <w:t xml:space="preserve">Backend:</w:t>
       </w:r>
       <w:r>
-        <w:t xml:space="preserve"> </w:t>
-      </w:r>
-      <w:r>
-        <w:t xml:space="preserve">ASP.NET Core (.NET 10) Web API (</w:t>
+        <w:t xml:space="preserve"> ASP.NET Core (.NET 10) Web API (</w:t>
       </w:r>
       <w:r>
         <w:rPr>
@@ -766,16 +582,7 @@
         <w:t xml:space="preserve">SplitSync.Api</w:t>
       </w:r>
       <w:r>
-        <w:t xml:space="preserve">), EF Core against PostgreSQL</w:t>
-      </w:r>
-      <w:r>
-        <w:t xml:space="preserve"> </w:t>
-      </w:r>
-      <w:r>
-        <w:t xml:space="preserve">(Supabase), migrations tracked under</w:t>
-      </w:r>
-      <w:r>
-        <w:t xml:space="preserve"> </w:t>
+        <w:t xml:space="preserve">), EF Core with PostgreSQL (Supabase), migrations in </w:t>
       </w:r>
       <w:r>
         <w:rPr>
@@ -803,10 +610,7 @@
         <w:t xml:space="preserve">Frontend:</w:t>
       </w:r>
       <w:r>
-        <w:t xml:space="preserve"> </w:t>
-      </w:r>
-      <w:r>
-        <w:t xml:space="preserve">React PWA (</w:t>
+        <w:t xml:space="preserve"> React + TypeScript PWA built with Vite (</w:t>
       </w:r>
       <w:r>
         <w:rPr>
@@ -815,10 +619,7 @@
         <w:t xml:space="preserve">client/</w:t>
       </w:r>
       <w:r>
-        <w:t xml:space="preserve">), talking to the API via</w:t>
-      </w:r>
-      <w:r>
-        <w:t xml:space="preserve"> </w:t>
+        <w:t xml:space="preserve">). It talks to the API through </w:t>
       </w:r>
       <w:r>
         <w:rPr>
@@ -827,16 +628,7 @@
         <w:t xml:space="preserve">lib/api.ts</w:t>
       </w:r>
       <w:r>
-        <w:t xml:space="preserve">, session handled</w:t>
-      </w:r>
-      <w:r>
-        <w:t xml:space="preserve"> </w:t>
-      </w:r>
-      <w:r>
-        <w:t xml:space="preserve">in</w:t>
-      </w:r>
-      <w:r>
-        <w:t xml:space="preserve"> </w:t>
+        <w:t xml:space="preserve"> and the session is handled in </w:t>
       </w:r>
       <w:r>
         <w:rPr>
@@ -864,10 +656,7 @@
         <w:t xml:space="preserve">Auth:</w:t>
       </w:r>
       <w:r>
-        <w:t xml:space="preserve"> </w:t>
-      </w:r>
-      <w:r>
-        <w:t xml:space="preserve">ASP.NET Core Identity (</w:t>
+        <w:t xml:space="preserve"> ASP.NET Core Identity (</w:t>
       </w:r>
       <w:r>
         <w:rPr>
@@ -876,16 +665,7 @@
         <w:t xml:space="preserve">IdentityCore&lt;AppUser&gt;</w:t>
       </w:r>
       <w:r>
-        <w:t xml:space="preserve">) issuing JWTs, validated on every</w:t>
-      </w:r>
-      <w:r>
-        <w:t xml:space="preserve"> </w:t>
-      </w:r>
-      <w:r>
-        <w:t xml:space="preserve">request via</w:t>
-      </w:r>
-      <w:r>
-        <w:t xml:space="preserve"> </w:t>
+        <w:t xml:space="preserve">) issuing JWTs, checked on every request with </w:t>
       </w:r>
       <w:r>
         <w:rPr>
@@ -894,22 +674,7 @@
         <w:t xml:space="preserve">AddJwtBearer</w:t>
       </w:r>
       <w:r>
-        <w:t xml:space="preserve">. All controllers except</w:t>
-      </w:r>
-      <w:r>
-        <w:t xml:space="preserve"> </w:t>
-      </w:r>
-      <w:r>
-        <w:rPr>
-          <w:rStyle w:val="VerbatimChar"/>
-        </w:rPr>
-        <w:t xml:space="preserve">AuthController</w:t>
-      </w:r>
-      <w:r>
-        <w:t xml:space="preserve">’s register/login are</w:t>
-      </w:r>
-      <w:r>
-        <w:t xml:space="preserve"> </w:t>
+        <w:t xml:space="preserve">. Everything except register/login needs you to be signed in (</w:t>
       </w:r>
       <w:r>
         <w:rPr>
@@ -918,222 +683,181 @@
         <w:t xml:space="preserve">[Authorize]</w:t>
       </w:r>
       <w:r>
-        <w:t xml:space="preserve">-gated.</w:t>
-      </w:r>
-    </w:p>
-    <w:p>
-      <w:pPr>
-        <w:pStyle w:val="FirstParagraph"/>
+        <w:t xml:space="preserve">).</w:t>
+      </w:r>
+    </w:p>
+    <w:p>
+      <w:pPr>
+        <w:pStyle w:val="Compact"/>
+        <w:numPr>
+          <w:ilvl w:val="0"/>
+          <w:numId w:val="1003"/>
+        </w:numPr>
       </w:pPr>
       <w:r>
         <w:rPr>
           <w:b/>
           <w:bCs/>
         </w:rPr>
-        <w:t xml:space="preserve">Gap vs. SRS:</w:t>
-      </w:r>
-      <w:r>
-        <w:t xml:space="preserve"> </w:t>
-      </w:r>
-      <w:r>
-        <w:t xml:space="preserve">the SRS specifies authentication delegated to a third-party IdP (Kinde) and</w:t>
-      </w:r>
-      <w:r>
-        <w:t xml:space="preserve"> </w:t>
-      </w:r>
-      <w:r>
-        <w:t xml:space="preserve">Neon as the Postgres host. The implementation instead self-manages credentials via ASP.NET</w:t>
-      </w:r>
-      <w:r>
-        <w:t xml:space="preserve"> </w:t>
-      </w:r>
-      <w:r>
-        <w:t xml:space="preserve">Identity + JWT, with migrations targeting Supabase. Worth a team decision on whether to</w:t>
-      </w:r>
-      <w:r>
-        <w:t xml:space="preserve"> </w:t>
-      </w:r>
-      <w:r>
-        <w:t xml:space="preserve">migrate to Kinde/Neon to match the SRS, or update the SRS to match the implementation.</w:t>
-      </w:r>
-    </w:p>
-    <w:bookmarkEnd w:id="14"/>
-    <w:bookmarkStart w:id="20" w:name="core-modules"/>
-    <w:p>
-      <w:pPr>
-        <w:pStyle w:val="Heading2"/>
-      </w:pPr>
-      <w:r>
-        <w:t xml:space="preserve">7. Core Modules</w:t>
-      </w:r>
-    </w:p>
-    <w:bookmarkStart w:id="15" w:name="authentication-authcontroller"/>
-    <w:p>
-      <w:pPr>
-        <w:pStyle w:val="Heading3"/>
-      </w:pPr>
-      <w:r>
-        <w:t xml:space="preserve">Authentication (</w:t>
-      </w:r>
-      <w:r>
-        <w:rPr>
-          <w:rStyle w:val="VerbatimChar"/>
-        </w:rPr>
-        <w:t xml:space="preserve">AuthController</w:t>
-      </w:r>
-      <w:r>
-        <w:t xml:space="preserve">)</w:t>
-      </w:r>
-    </w:p>
-    <w:p>
-      <w:pPr>
-        <w:pStyle w:val="Compact"/>
-        <w:numPr>
-          <w:ilvl w:val="0"/>
-          <w:numId w:val="1004"/>
-        </w:numPr>
-      </w:pPr>
-      <w:r>
-        <w:rPr>
-          <w:rStyle w:val="VerbatimChar"/>
-        </w:rPr>
-        <w:t xml:space="preserve">POST /api/auth/register</w:t>
-      </w:r>
-      <w:r>
-        <w:t xml:space="preserve"> </w:t>
-      </w:r>
-      <w:r>
-        <w:t xml:space="preserve">— creates an</w:t>
-      </w:r>
-      <w:r>
-        <w:t xml:space="preserve"> </w:t>
-      </w:r>
-      <w:r>
-        <w:rPr>
-          <w:rStyle w:val="VerbatimChar"/>
-        </w:rPr>
-        <w:t xml:space="preserve">AppUser</w:t>
-      </w:r>
-      <w:r>
-        <w:t xml:space="preserve"> </w:t>
-      </w:r>
-      <w:r>
-        <w:t xml:space="preserve">from email + password; usernames are</w:t>
-      </w:r>
-      <w:r>
-        <w:t xml:space="preserve"> </w:t>
-      </w:r>
-      <w:r>
-        <w:t xml:space="preserve">auto-generated rather than chosen; rejects duplicate emails; returns a JWT.</w:t>
-      </w:r>
-    </w:p>
-    <w:p>
-      <w:pPr>
-        <w:pStyle w:val="Compact"/>
-        <w:numPr>
-          <w:ilvl w:val="0"/>
-          <w:numId w:val="1004"/>
-        </w:numPr>
-      </w:pPr>
-      <w:r>
-        <w:rPr>
-          <w:rStyle w:val="VerbatimChar"/>
-        </w:rPr>
-        <w:t xml:space="preserve">POST /api/auth/login</w:t>
-      </w:r>
-      <w:r>
-        <w:t xml:space="preserve"> </w:t>
-      </w:r>
-      <w:r>
-        <w:t xml:space="preserve">— accepts email or username; returns a JWT.</w:t>
-      </w:r>
-    </w:p>
-    <w:p>
-      <w:pPr>
-        <w:pStyle w:val="Compact"/>
-        <w:numPr>
-          <w:ilvl w:val="0"/>
-          <w:numId w:val="1004"/>
-        </w:numPr>
-      </w:pPr>
-      <w:r>
-        <w:rPr>
-          <w:rStyle w:val="VerbatimChar"/>
-        </w:rPr>
-        <w:t xml:space="preserve">GET /api/auth/me</w:t>
-      </w:r>
-      <w:r>
-        <w:t xml:space="preserve"> </w:t>
-      </w:r>
-      <w:r>
-        <w:t xml:space="preserve">— returns the caller’s id/username/email from JWT claims.</w:t>
-      </w:r>
-    </w:p>
-    <w:p>
-      <w:pPr>
-        <w:pStyle w:val="Compact"/>
-        <w:numPr>
-          <w:ilvl w:val="0"/>
-          <w:numId w:val="1004"/>
-        </w:numPr>
-      </w:pPr>
-      <w:r>
-        <w:rPr>
-          <w:rStyle w:val="VerbatimChar"/>
-        </w:rPr>
-        <w:t xml:space="preserve">DELETE /api/auth/me</w:t>
-      </w:r>
-      <w:r>
-        <w:t xml:space="preserve"> </w:t>
-      </w:r>
-      <w:r>
-        <w:t xml:space="preserve">— deletes the account; blocked (409) if the user still owns a group.</w:t>
-      </w:r>
-    </w:p>
-    <w:bookmarkEnd w:id="15"/>
-    <w:bookmarkStart w:id="16" w:name="groups-groupscontroller"/>
-    <w:p>
-      <w:pPr>
-        <w:pStyle w:val="Heading3"/>
-      </w:pPr>
-      <w:r>
-        <w:t xml:space="preserve">Groups (</w:t>
-      </w:r>
-      <w:r>
-        <w:rPr>
-          <w:rStyle w:val="VerbatimChar"/>
-        </w:rPr>
-        <w:t xml:space="preserve">GroupsController</w:t>
-      </w:r>
-      <w:r>
-        <w:t xml:space="preserve">)</w:t>
+        <w:t xml:space="preserve">Receipt storage:</w:t>
+      </w:r>
+      <w:r>
+        <w:t xml:space="preserve"> photos are saved in Postgres in their own table (</w:t>
+      </w:r>
+      <w:r>
+        <w:rPr>
+          <w:rStyle w:val="VerbatimChar"/>
+        </w:rPr>
+        <w:t xml:space="preserve">ExpenseReceipts</w:t>
+      </w:r>
+      <w:r>
+        <w:t xml:space="preserve">) behind an </w:t>
+      </w:r>
+      <w:r>
+        <w:rPr>
+          <w:rStyle w:val="VerbatimChar"/>
+        </w:rPr>
+        <w:t xml:space="preserve">IReceiptStorage</w:t>
+      </w:r>
+      <w:r>
+        <w:t xml:space="preserve"> interface, so it could be switched to cloud storage later without changing the controllers.</w:t>
       </w:r>
     </w:p>
     <w:p>
       <w:pPr>
         <w:pStyle w:val="FirstParagraph"/>
       </w:pPr>
-      <w:r>
-        <w:t xml:space="preserve">All endpoints require membership; renaming, deleting, and adding/removing members require</w:t>
-      </w:r>
-      <w:r>
-        <w:t xml:space="preserve"> </w:t>
-      </w:r>
-      <w:r>
-        <w:t xml:space="preserve">the caller to be the group’s</w:t>
-      </w:r>
-      <w:r>
-        <w:t xml:space="preserve"> </w:t>
-      </w:r>
       <w:r>
         <w:rPr>
           <w:b/>
           <w:bCs/>
         </w:rPr>
-        <w:t xml:space="preserve">creator</w:t>
-      </w:r>
-      <w:r>
-        <w:t xml:space="preserve">.</w:t>
+        <w:t xml:space="preserve">Gap vs. SRS:</w:t>
+      </w:r>
+      <w:r>
+        <w:t xml:space="preserve"> the SRS says login would be handled by a third party (Kinde) and the database would be on Neon. What we built uses ASP.NET Identity + JWT and a Supabase database instead. The team still needs to decide whether to update the SRS or change the code, updating the SRS is a lot less work.</w:t>
+      </w:r>
+    </w:p>
+    <w:p>
+      <w:pPr>
+        <w:pStyle w:val="Heading2"/>
+      </w:pPr>
+      <w:r>
+        <w:t xml:space="preserve">7. Core Modules</w:t>
+      </w:r>
+    </w:p>
+    <w:p>
+      <w:pPr>
+        <w:pStyle w:val="Heading3"/>
+      </w:pPr>
+      <w:r>
+        <w:t xml:space="preserve">Authentication (</w:t>
+      </w:r>
+      <w:r>
+        <w:rPr>
+          <w:rStyle w:val="VerbatimChar"/>
+        </w:rPr>
+        <w:t xml:space="preserve">AuthController</w:t>
+      </w:r>
+      <w:r>
+        <w:t xml:space="preserve">)</w:t>
+      </w:r>
+    </w:p>
+    <w:p>
+      <w:pPr>
+        <w:pStyle w:val="Compact"/>
+        <w:numPr>
+          <w:ilvl w:val="0"/>
+          <w:numId w:val="1004"/>
+        </w:numPr>
+      </w:pPr>
+      <w:r>
+        <w:rPr>
+          <w:rStyle w:val="VerbatimChar"/>
+        </w:rPr>
+        <w:t xml:space="preserve">POST /api/auth/register</w:t>
+      </w:r>
+      <w:r>
+        <w:t xml:space="preserve">: creates an account from email + password. Usernames are generated automatically, you don't pick one. Duplicate emails are rejected. Returns a JWT.</w:t>
+      </w:r>
+    </w:p>
+    <w:p>
+      <w:pPr>
+        <w:pStyle w:val="Compact"/>
+        <w:numPr>
+          <w:ilvl w:val="0"/>
+          <w:numId w:val="1004"/>
+        </w:numPr>
+      </w:pPr>
+      <w:r>
+        <w:rPr>
+          <w:rStyle w:val="VerbatimChar"/>
+        </w:rPr>
+        <w:t xml:space="preserve">POST /api/auth/login</w:t>
+      </w:r>
+      <w:r>
+        <w:t xml:space="preserve">: sign in with email or username, returns a JWT.</w:t>
+      </w:r>
+    </w:p>
+    <w:p>
+      <w:pPr>
+        <w:pStyle w:val="Compact"/>
+        <w:numPr>
+          <w:ilvl w:val="0"/>
+          <w:numId w:val="1004"/>
+        </w:numPr>
+      </w:pPr>
+      <w:r>
+        <w:rPr>
+          <w:rStyle w:val="VerbatimChar"/>
+        </w:rPr>
+        <w:t xml:space="preserve">GET /api/auth/me</w:t>
+      </w:r>
+      <w:r>
+        <w:t xml:space="preserve">: returns your id, username and email from the token.</w:t>
+      </w:r>
+    </w:p>
+    <w:p>
+      <w:pPr>
+        <w:pStyle w:val="Compact"/>
+        <w:numPr>
+          <w:ilvl w:val="0"/>
+          <w:numId w:val="1004"/>
+        </w:numPr>
+      </w:pPr>
+      <w:r>
+        <w:rPr>
+          <w:rStyle w:val="VerbatimChar"/>
+        </w:rPr>
+        <w:t xml:space="preserve">DELETE /api/auth/me</w:t>
+      </w:r>
+      <w:r>
+        <w:t xml:space="preserve">: deletes your account. Returns 409 if you still own a group, you have to delete those first.</w:t>
+      </w:r>
+    </w:p>
+    <w:p>
+      <w:pPr>
+        <w:pStyle w:val="Heading3"/>
+      </w:pPr>
+      <w:r>
+        <w:t xml:space="preserve">Groups (</w:t>
+      </w:r>
+      <w:r>
+        <w:rPr>
+          <w:rStyle w:val="VerbatimChar"/>
+        </w:rPr>
+        <w:t xml:space="preserve">GroupsController</w:t>
+      </w:r>
+      <w:r>
+        <w:t xml:space="preserve">)</w:t>
+      </w:r>
+    </w:p>
+    <w:p>
+      <w:pPr>
+        <w:pStyle w:val="FirstParagraph"/>
+      </w:pPr>
+      <w:r>
+        <w:t xml:space="preserve">You have to be a member of the group for all of these. Renaming, deleting and adding/removing members is creator only.</w:t>
       </w:r>
     </w:p>
     <w:p>
@@ -1151,10 +875,7 @@
         <w:t xml:space="preserve">POST /api/groups</w:t>
       </w:r>
       <w:r>
-        <w:t xml:space="preserve"> </w:t>
-      </w:r>
-      <w:r>
-        <w:t xml:space="preserve">— create; creator auto-added as first member.</w:t>
+        <w:t xml:space="preserve">: create a group, the creator is added as the first member.</w:t>
       </w:r>
     </w:p>
     <w:p>
@@ -1172,10 +893,7 @@
         <w:t xml:space="preserve">GET /api/groups</w:t>
       </w:r>
       <w:r>
-        <w:t xml:space="preserve"> </w:t>
-      </w:r>
-      <w:r>
-        <w:t xml:space="preserve">— list groups the caller belongs to.</w:t>
+        <w:t xml:space="preserve">: list the groups you are in.</w:t>
       </w:r>
     </w:p>
     <w:p>
@@ -1193,10 +911,7 @@
         <w:t xml:space="preserve">PATCH /api/groups/{id}</w:t>
       </w:r>
       <w:r>
-        <w:t xml:space="preserve"> </w:t>
-      </w:r>
-      <w:r>
-        <w:t xml:space="preserve">— rename (creator only).</w:t>
+        <w:t xml:space="preserve">: rename (creator only).</w:t>
       </w:r>
     </w:p>
     <w:p>
@@ -1214,10 +929,7 @@
         <w:t xml:space="preserve">DELETE /api/groups/{id}</w:t>
       </w:r>
       <w:r>
-        <w:t xml:space="preserve"> </w:t>
-      </w:r>
-      <w:r>
-        <w:t xml:space="preserve">— delete (creator only).</w:t>
+        <w:t xml:space="preserve">: delete, everyone else in the group gets a notification (creator only).</w:t>
       </w:r>
     </w:p>
     <w:p>
@@ -1235,10 +947,7 @@
         <w:t xml:space="preserve">POST /api/groups/{id}/members</w:t>
       </w:r>
       <w:r>
-        <w:t xml:space="preserve"> </w:t>
-      </w:r>
-      <w:r>
-        <w:t xml:space="preserve">— add a member by username (creator only).</w:t>
+        <w:t xml:space="preserve">: add a member by username, they get a notification (creator only).</w:t>
       </w:r>
     </w:p>
     <w:p>
@@ -1253,19 +962,28 @@
         <w:rPr>
           <w:rStyle w:val="VerbatimChar"/>
         </w:rPr>
+        <w:t xml:space="preserve">GET /api/groups/{id}/member-candidates?q=</w:t>
+      </w:r>
+      <w:r>
+        <w:t xml:space="preserve">: search usernames when adding a member. Needs at least 2 characters and skips people already in the group (creator only).</w:t>
+      </w:r>
+    </w:p>
+    <w:p>
+      <w:pPr>
+        <w:pStyle w:val="Compact"/>
+        <w:numPr>
+          <w:ilvl w:val="0"/>
+          <w:numId w:val="1005"/>
+        </w:numPr>
+      </w:pPr>
+      <w:r>
+        <w:rPr>
+          <w:rStyle w:val="VerbatimChar"/>
+        </w:rPr>
         <w:t xml:space="preserve">DELETE /api/groups/{id}/members/{username}</w:t>
       </w:r>
       <w:r>
-        <w:t xml:space="preserve"> </w:t>
-      </w:r>
-      <w:r>
-        <w:t xml:space="preserve">— remove a member (creator only; the creator</w:t>
-      </w:r>
-      <w:r>
-        <w:t xml:space="preserve"> </w:t>
-      </w:r>
-      <w:r>
-        <w:t xml:space="preserve">can’t be removed this way).</w:t>
+        <w:t xml:space="preserve">: remove a member, they get a notification (creator only, the creator can't be removed).</w:t>
       </w:r>
     </w:p>
     <w:p>
@@ -1283,10 +1001,7 @@
         <w:t xml:space="preserve">POST /api/groups/{id}/join</w:t>
       </w:r>
       <w:r>
-        <w:t xml:space="preserve"> </w:t>
-      </w:r>
-      <w:r>
-        <w:t xml:space="preserve">— self-join by group ID.</w:t>
+        <w:t xml:space="preserve">: join a group using its ID.</w:t>
       </w:r>
     </w:p>
     <w:p>
@@ -1304,14 +1019,9 @@
         <w:t xml:space="preserve">POST /api/groups/{id}/leave</w:t>
       </w:r>
       <w:r>
-        <w:t xml:space="preserve"> </w:t>
-      </w:r>
-      <w:r>
-        <w:t xml:space="preserve">— leave (creator can’t leave — must delete instead).</w:t>
-      </w:r>
-    </w:p>
-    <w:bookmarkEnd w:id="16"/>
-    <w:bookmarkStart w:id="17" w:name="expenses-splitting-expensescontroller"/>
+        <w:t xml:space="preserve">: leave a group. The creator can't leave, the group has to be deleted instead.</w:t>
+      </w:r>
+    </w:p>
     <w:p>
       <w:pPr>
         <w:pStyle w:val="Heading3"/>
@@ -1344,10 +1054,7 @@
         <w:t xml:space="preserve">GET /api/groups/{groupId}/expenses</w:t>
       </w:r>
       <w:r>
-        <w:t xml:space="preserve"> </w:t>
-      </w:r>
-      <w:r>
-        <w:t xml:space="preserve">— list a group’s expenses (members only).</w:t>
+        <w:t xml:space="preserve">: list a group's expenses (members only).</w:t>
       </w:r>
     </w:p>
     <w:p>
@@ -1365,22 +1072,97 @@
         <w:t xml:space="preserve">POST /api/groups/{groupId}/expenses</w:t>
       </w:r>
       <w:r>
-        <w:t xml:space="preserve"> </w:t>
-      </w:r>
-      <w:r>
-        <w:t xml:space="preserve">— record an expense against one of three split</w:t>
-      </w:r>
-      <w:r>
-        <w:t xml:space="preserve"> </w:t>
-      </w:r>
-      <w:r>
-        <w:t xml:space="preserve">methods, validated server-side (equal / unequal — must sum to the total / percentage —</w:t>
-      </w:r>
-      <w:r>
-        <w:t xml:space="preserve"> </w:t>
-      </w:r>
-      <w:r>
-        <w:t xml:space="preserve">must sum to 100%).</w:t>
+        <w:t xml:space="preserve">: add an expense with one of three split methods, checked on the server (unequal amounts have to add up to the total, percentages have to add up to 100%). Other members get a notification.</w:t>
+      </w:r>
+    </w:p>
+    <w:p>
+      <w:pPr>
+        <w:pStyle w:val="Compact"/>
+        <w:numPr>
+          <w:ilvl w:val="0"/>
+          <w:numId w:val="1006"/>
+        </w:numPr>
+      </w:pPr>
+      <w:r>
+        <w:rPr>
+          <w:rStyle w:val="VerbatimChar"/>
+        </w:rPr>
+        <w:t xml:space="preserve">PATCH /api/groups/{groupId}/expenses/{expenseId}</w:t>
+      </w:r>
+      <w:r>
+        <w:t xml:space="preserve">: edit an expense (only the person who paid).</w:t>
+      </w:r>
+    </w:p>
+    <w:p>
+      <w:pPr>
+        <w:pStyle w:val="Compact"/>
+        <w:numPr>
+          <w:ilvl w:val="0"/>
+          <w:numId w:val="1006"/>
+        </w:numPr>
+      </w:pPr>
+      <w:r>
+        <w:rPr>
+          <w:rStyle w:val="VerbatimChar"/>
+        </w:rPr>
+        <w:t xml:space="preserve">DELETE /api/groups/{groupId}/expenses/{expenseId}</w:t>
+      </w:r>
+      <w:r>
+        <w:t xml:space="preserve">: delete an expense (only the person who paid).</w:t>
+      </w:r>
+    </w:p>
+    <w:p>
+      <w:pPr>
+        <w:pStyle w:val="Compact"/>
+        <w:numPr>
+          <w:ilvl w:val="0"/>
+          <w:numId w:val="1006"/>
+        </w:numPr>
+      </w:pPr>
+      <w:r>
+        <w:rPr>
+          <w:rStyle w:val="VerbatimChar"/>
+        </w:rPr>
+        <w:t xml:space="preserve">PUT /api/groups/{groupId}/expenses/{expenseId}/receipt</w:t>
+      </w:r>
+      <w:r>
+        <w:t xml:space="preserve">: upload or replace the receipt photo (only the person who paid). Max 5 MB, JPEG/PNG/WebP only. The server checks the actual file bytes, not just the file name.</w:t>
+      </w:r>
+    </w:p>
+    <w:p>
+      <w:pPr>
+        <w:pStyle w:val="Compact"/>
+        <w:numPr>
+          <w:ilvl w:val="0"/>
+          <w:numId w:val="1006"/>
+        </w:numPr>
+      </w:pPr>
+      <w:r>
+        <w:rPr>
+          <w:rStyle w:val="VerbatimChar"/>
+        </w:rPr>
+        <w:t xml:space="preserve">GET /api/groups/{groupId}/expenses/{expenseId}/receipt</w:t>
+      </w:r>
+      <w:r>
+        <w:t xml:space="preserve">: view the receipt photo (members only).</w:t>
+      </w:r>
+    </w:p>
+    <w:p>
+      <w:pPr>
+        <w:pStyle w:val="Compact"/>
+        <w:numPr>
+          <w:ilvl w:val="0"/>
+          <w:numId w:val="1006"/>
+        </w:numPr>
+      </w:pPr>
+      <w:r>
+        <w:rPr>
+          <w:rStyle w:val="VerbatimChar"/>
+        </w:rPr>
+        <w:t xml:space="preserve">DELETE /api/groups/{groupId}/expenses/{expenseId}/receipt</w:t>
+      </w:r>
+      <w:r>
+        <w:t xml:space="preserve">: remove the receipt photo (only the person who paid).</w:t>
       </w:r>
     </w:p>
     <w:p>
@@ -1388,23 +1170,17 @@
         <w:pStyle w:val="FirstParagraph"/>
       </w:pPr>
       <w:r>
-        <w:t xml:space="preserve">Split math works in integer cents, not decimals, specifically so shares always sum back to</w:t>
-      </w:r>
-      <w:r>
-        <w:t xml:space="preserve"> </w:t>
-      </w:r>
-      <w:r>
-        <w:t xml:space="preserve">the exact original amount:</w:t>
-      </w:r>
-      <w:r>
-        <w:t xml:space="preserve"> </w:t>
-      </w:r>
-      <w:r>
-        <w:t xml:space="preserve">-</w:t>
-      </w:r>
-      <w:r>
-        <w:t xml:space="preserve"> </w:t>
-      </w:r>
+        <w:t xml:space="preserve">The split maths is done in whole cents instead of decimals, so the shares always add back up to the exact total:</w:t>
+      </w:r>
+    </w:p>
+    <w:p>
+      <w:pPr>
+        <w:pStyle w:val="Compact"/>
+        <w:numPr>
+          <w:ilvl w:val="0"/>
+          <w:numId w:val="1006"/>
+        </w:numPr>
+      </w:pPr>
       <w:r>
         <w:rPr>
           <w:i/>
@@ -1413,20 +1189,17 @@
         <w:t xml:space="preserve">Equal split:</w:t>
       </w:r>
       <w:r>
-        <w:t xml:space="preserve"> </w:t>
-      </w:r>
-      <w:r>
-        <w:t xml:space="preserve">total cents divided evenly; leftover cent(s) go to the first members listed.</w:t>
-      </w:r>
-      <w:r>
-        <w:t xml:space="preserve"> </w:t>
-      </w:r>
-      <w:r>
-        <w:t xml:space="preserve">-</w:t>
-      </w:r>
-      <w:r>
-        <w:t xml:space="preserve"> </w:t>
-      </w:r>
+        <w:t xml:space="preserve"> the total in cents is divided evenly, and any leftover cents go to the first members in the list.</w:t>
+      </w:r>
+    </w:p>
+    <w:p>
+      <w:pPr>
+        <w:pStyle w:val="Compact"/>
+        <w:numPr>
+          <w:ilvl w:val="0"/>
+          <w:numId w:val="1006"/>
+        </w:numPr>
+      </w:pPr>
       <w:r>
         <w:rPr>
           <w:i/>
@@ -1435,20 +1208,17 @@
         <w:t xml:space="preserve">Percentage split:</w:t>
       </w:r>
       <w:r>
-        <w:t xml:space="preserve"> </w:t>
-      </w:r>
-      <w:r>
-        <w:t xml:space="preserve">largest-remainder method — floor each member’s proportional cents, hand</w:t>
-      </w:r>
-      <w:r>
-        <w:t xml:space="preserve"> </w:t>
-      </w:r>
-      <w:r>
-        <w:t xml:space="preserve">out leftover cents to whoever’s fractional remainder was largest.</w:t>
-      </w:r>
-    </w:p>
-    <w:bookmarkEnd w:id="17"/>
-    <w:bookmarkStart w:id="18" w:name="X06d74d375abef993872475e97fbf9dd3ab29737"/>
+        <w:t xml:space="preserve"> largest remainder method. Everyone gets their share rounded down to the cent, then the leftover cents go to whoever had the biggest fraction cut off.</w:t>
+      </w:r>
+    </w:p>
+    <w:p>
+      <w:pPr>
+        <w:pStyle w:val="BodyText"/>
+      </w:pPr>
+      <w:r>
+        <w:t xml:space="preserve">Receipt photos are shrunk in the browser before uploading (max 1600px, JPEG). This keeps them to a few hundred KB and also removes location data from the photo.</w:t>
+      </w:r>
+    </w:p>
     <w:p>
       <w:pPr>
         <w:pStyle w:val="Heading3"/>
@@ -1481,38 +1251,7 @@
         <w:t xml:space="preserve">GET /api/groups/{groupId}/balances</w:t>
       </w:r>
       <w:r>
-        <w:t xml:space="preserve"> </w:t>
-      </w:r>
-      <w:r>
-        <w:t xml:space="preserve">— computes the signed-in user’s net balance against</w:t>
-      </w:r>
-      <w:r>
-        <w:t xml:space="preserve"> </w:t>
-      </w:r>
-      <w:r>
-        <w:t xml:space="preserve">every other member they share a debt with, by walking all expense shares and recorded</w:t>
-      </w:r>
-      <w:r>
-        <w:t xml:space="preserve"> </w:t>
-      </w:r>
-      <w:r>
-        <w:t xml:space="preserve">settlements. Balances between two</w:t>
-      </w:r>
-      <w:r>
-        <w:t xml:space="preserve"> </w:t>
-      </w:r>
-      <w:r>
-        <w:rPr>
-          <w:i/>
-          <w:iCs/>
-        </w:rPr>
-        <w:t xml:space="preserve">other</w:t>
-      </w:r>
-      <w:r>
-        <w:t xml:space="preserve"> </w:t>
-      </w:r>
-      <w:r>
-        <w:t xml:space="preserve">members are deliberately excluded.</w:t>
+        <w:t xml:space="preserve">: works out your net balance with every other member by going through all the expense shares and settlements. Balances between two other members aren't shown.</w:t>
       </w:r>
     </w:p>
     <w:p>
@@ -1530,10 +1269,7 @@
         <w:t xml:space="preserve">GET /api/groups/{groupId}/settlements</w:t>
       </w:r>
       <w:r>
-        <w:t xml:space="preserve"> </w:t>
-      </w:r>
-      <w:r>
-        <w:t xml:space="preserve">— list recorded settlements for a group.</w:t>
+        <w:t xml:space="preserve">: list the settlements recorded in a group.</w:t>
       </w:r>
     </w:p>
     <w:p>
@@ -1551,25 +1287,102 @@
         <w:t xml:space="preserve">POST /api/groups/{groupId}/settlements</w:t>
       </w:r>
       <w:r>
-        <w:t xml:space="preserve"> </w:t>
-      </w:r>
-      <w:r>
-        <w:t xml:space="preserve">— record a payment between the caller and another</w:t>
-      </w:r>
-      <w:r>
-        <w:t xml:space="preserve"> </w:t>
-      </w:r>
-      <w:r>
-        <w:t xml:space="preserve">member, reducing the computed balance.</w:t>
-      </w:r>
-    </w:p>
-    <w:bookmarkEnd w:id="18"/>
-    <w:bookmarkStart w:id="19" w:name="frontend-pages"/>
+        <w:t xml:space="preserve">: record a payment between you and another member, which reduces the balance. The other person gets a notification.</w:t>
+      </w:r>
+    </w:p>
     <w:p>
       <w:pPr>
         <w:pStyle w:val="Heading3"/>
       </w:pPr>
       <w:r>
+        <w:t xml:space="preserve">Notifications (</w:t>
+      </w:r>
+      <w:r>
+        <w:rPr>
+          <w:rStyle w:val="VerbatimChar"/>
+        </w:rPr>
+        <w:t xml:space="preserve">NotificationsController</w:t>
+      </w:r>
+      <w:r>
+        <w:t xml:space="preserve">)</w:t>
+      </w:r>
+    </w:p>
+    <w:p>
+      <w:pPr>
+        <w:pStyle w:val="Compact"/>
+        <w:numPr>
+          <w:ilvl w:val="0"/>
+          <w:numId w:val="1007"/>
+        </w:numPr>
+      </w:pPr>
+      <w:r>
+        <w:rPr>
+          <w:rStyle w:val="VerbatimChar"/>
+        </w:rPr>
+        <w:t xml:space="preserve">GET /api/notifications</w:t>
+      </w:r>
+      <w:r>
+        <w:t xml:space="preserve">: your latest 50 notifications, newest first.</w:t>
+      </w:r>
+    </w:p>
+    <w:p>
+      <w:pPr>
+        <w:pStyle w:val="Compact"/>
+        <w:numPr>
+          <w:ilvl w:val="0"/>
+          <w:numId w:val="1007"/>
+        </w:numPr>
+      </w:pPr>
+      <w:r>
+        <w:rPr>
+          <w:rStyle w:val="VerbatimChar"/>
+        </w:rPr>
+        <w:t xml:space="preserve">GET /api/notifications/unread-count</w:t>
+      </w:r>
+      <w:r>
+        <w:t xml:space="preserve">: how many are unread, for the bell icon.</w:t>
+      </w:r>
+    </w:p>
+    <w:p>
+      <w:pPr>
+        <w:pStyle w:val="Compact"/>
+        <w:numPr>
+          <w:ilvl w:val="0"/>
+          <w:numId w:val="1007"/>
+        </w:numPr>
+      </w:pPr>
+      <w:r>
+        <w:rPr>
+          <w:rStyle w:val="VerbatimChar"/>
+        </w:rPr>
+        <w:t xml:space="preserve">POST /api/notifications/{id}/read</w:t>
+      </w:r>
+      <w:r>
+        <w:t xml:space="preserve"> and </w:t>
+      </w:r>
+      <w:r>
+        <w:rPr>
+          <w:rStyle w:val="VerbatimChar"/>
+        </w:rPr>
+        <w:t xml:space="preserve">POST /api/notifications/read-all</w:t>
+      </w:r>
+      <w:r>
+        <w:t xml:space="preserve">: mark notifications as read.</w:t>
+      </w:r>
+    </w:p>
+    <w:p>
+      <w:pPr>
+        <w:pStyle w:val="BodyText"/>
+      </w:pPr>
+      <w:r>
+        <w:t xml:space="preserve">You get a notification when someone adds an expense in your group, records a settlement with you, adds or removes you from a group, or deletes a group you're in.</w:t>
+      </w:r>
+    </w:p>
+    <w:p>
+      <w:pPr>
+        <w:pStyle w:val="Heading3"/>
+      </w:pPr>
+      <w:r>
         <w:t xml:space="preserve">Frontend Pages</w:t>
       </w:r>
     </w:p>
@@ -1588,10 +1401,7 @@
         <w:t xml:space="preserve">LandingPage</w:t>
       </w:r>
       <w:r>
-        <w:t xml:space="preserve"> </w:t>
-      </w:r>
-      <w:r>
-        <w:t xml:space="preserve">— unauthenticated entry point.</w:t>
+        <w:t xml:space="preserve">: the page you see before signing in.</w:t>
       </w:r>
     </w:p>
     <w:p>
@@ -1609,10 +1419,7 @@
         <w:t xml:space="preserve">AuthenticationPage</w:t>
       </w:r>
       <w:r>
-        <w:t xml:space="preserve"> </w:t>
-      </w:r>
-      <w:r>
-        <w:t xml:space="preserve">— login/register.</w:t>
+        <w:t xml:space="preserve">: sign in / create account, with a show/hide password button.</w:t>
       </w:r>
     </w:p>
     <w:p>
@@ -1630,10 +1437,7 @@
         <w:t xml:space="preserve">HomePage</w:t>
       </w:r>
       <w:r>
-        <w:t xml:space="preserve"> </w:t>
-      </w:r>
-      <w:r>
-        <w:t xml:space="preserve">— signed-in landing page.</w:t>
+        <w:t xml:space="preserve">: the first page after signing in.</w:t>
       </w:r>
     </w:p>
     <w:p>
@@ -1651,10 +1455,7 @@
         <w:t xml:space="preserve">ProfilePage</w:t>
       </w:r>
       <w:r>
-        <w:t xml:space="preserve"> </w:t>
-      </w:r>
-      <w:r>
-        <w:t xml:space="preserve">— reflects the signed-in user’s real account data.</w:t>
+        <w:t xml:space="preserve">: shows your account details and lets you delete your account.</w:t>
       </w:r>
     </w:p>
     <w:p>
@@ -1672,72 +1473,81 @@
         <w:t xml:space="preserve">GroupsPage</w:t>
       </w:r>
       <w:r>
-        <w:t xml:space="preserve"> </w:t>
-      </w:r>
-      <w:r>
-        <w:t xml:space="preserve">— create/list/join groups, add-member form, wired to the live API.</w:t>
-      </w:r>
-    </w:p>
-    <w:bookmarkEnd w:id="19"/>
-    <w:bookmarkEnd w:id="20"/>
-    <w:bookmarkStart w:id="21" w:name="testing"/>
+        <w:t xml:space="preserve">: list, create and join groups.</w:t>
+      </w:r>
+    </w:p>
+    <w:p>
+      <w:pPr>
+        <w:pStyle w:val="Compact"/>
+        <w:numPr>
+          <w:ilvl w:val="0"/>
+          <w:numId w:val="1008"/>
+        </w:numPr>
+      </w:pPr>
+      <w:r>
+        <w:rPr>
+          <w:rStyle w:val="VerbatimChar"/>
+        </w:rPr>
+        <w:t xml:space="preserve">GroupDashboardPage</w:t>
+      </w:r>
+      <w:r>
+        <w:t xml:space="preserve">: one group's page with Overview (balances, add expense, record settlement), Transactions (expenses, settlements and receipts) and Members tabs. It refreshes itself every 20 seconds and when you come back to the tab, so you see other people's changes without reloading.</w:t>
+      </w:r>
+    </w:p>
+    <w:p>
+      <w:pPr>
+        <w:pStyle w:val="Compact"/>
+        <w:numPr>
+          <w:ilvl w:val="0"/>
+          <w:numId w:val="1008"/>
+        </w:numPr>
+      </w:pPr>
+      <w:r>
+        <w:t xml:space="preserve">Main components: </w:t>
+      </w:r>
+      <w:r>
+        <w:rPr>
+          <w:rStyle w:val="VerbatimChar"/>
+        </w:rPr>
+        <w:t xml:space="preserve">AddExpenseModal</w:t>
+      </w:r>
+      <w:r>
+        <w:t xml:space="preserve"> (add/edit expenses, split amounts auto balance as you type, attach a receipt), </w:t>
+      </w:r>
+      <w:r>
+        <w:rPr>
+          <w:rStyle w:val="VerbatimChar"/>
+        </w:rPr>
+        <w:t xml:space="preserve">ReceiptModal</w:t>
+      </w:r>
+      <w:r>
+        <w:t xml:space="preserve"> (view a receipt), </w:t>
+      </w:r>
+      <w:r>
+        <w:rPr>
+          <w:rStyle w:val="VerbatimChar"/>
+        </w:rPr>
+        <w:t xml:space="preserve">NotificationBell</w:t>
+      </w:r>
+      <w:r>
+        <w:t xml:space="preserve"> and </w:t>
+      </w:r>
+      <w:r>
+        <w:rPr>
+          <w:rStyle w:val="VerbatimChar"/>
+        </w:rPr>
+        <w:t xml:space="preserve">ThemeToggle</w:t>
+      </w:r>
+      <w:r>
+        <w:t xml:space="preserve"> (light/dark mode).</w:t>
+      </w:r>
+    </w:p>
     <w:p>
       <w:pPr>
         <w:pStyle w:val="Heading2"/>
       </w:pPr>
       <w:r>
         <w:t xml:space="preserve">8. Testing</w:t>
-      </w:r>
-    </w:p>
-    <w:p>
-      <w:pPr>
-        <w:pStyle w:val="Compact"/>
-        <w:numPr>
-          <w:ilvl w:val="0"/>
-          <w:numId w:val="1009"/>
-        </w:numPr>
-      </w:pPr>
-      <w:r>
-        <w:t xml:space="preserve">Backend: unit/integration tests for</w:t>
-      </w:r>
-      <w:r>
-        <w:t xml:space="preserve"> </w:t>
-      </w:r>
-      <w:r>
-        <w:rPr>
-          <w:rStyle w:val="VerbatimChar"/>
-        </w:rPr>
-        <w:t xml:space="preserve">HealthController</w:t>
-      </w:r>
-      <w:r>
-        <w:t xml:space="preserve">/</w:t>
-      </w:r>
-      <w:r>
-        <w:rPr>
-          <w:rStyle w:val="VerbatimChar"/>
-        </w:rPr>
-        <w:t xml:space="preserve">HealthEndpoint</w:t>
-      </w:r>
-      <w:r>
-        <w:t xml:space="preserve">.</w:t>
-      </w:r>
-    </w:p>
-    <w:p>
-      <w:pPr>
-        <w:pStyle w:val="Compact"/>
-        <w:numPr>
-          <w:ilvl w:val="0"/>
-          <w:numId w:val="1009"/>
-        </w:numPr>
-      </w:pPr>
-      <w:r>
-        <w:t xml:space="preserve">Frontend: tests covering authentication, signup, groups, activity, expenses, recurring</w:t>
-      </w:r>
-      <w:r>
-        <w:t xml:space="preserve"> </w:t>
-      </w:r>
-      <w:r>
-        <w:t xml:space="preserve">expenses, settings, settlements; e2e coverage for the authentication page.</w:t>
       </w:r>
     </w:p>
     <w:p>
@@ -1753,23 +1563,68 @@
           <w:b/>
           <w:bCs/>
         </w:rPr>
+        <w:t xml:space="preserve">Backend:</w:t>
+      </w:r>
+      <w:r>
+        <w:t xml:space="preserve"> integration tests in </w:t>
+      </w:r>
+      <w:r>
+        <w:rPr>
+          <w:rStyle w:val="VerbatimChar"/>
+        </w:rPr>
+        <w:t xml:space="preserve">server.Tests</w:t>
+      </w:r>
+      <w:r>
+        <w:t xml:space="preserve"> using an in-memory database. They cover auth, groups, expenses (including the split maths), settlements, receipt photos and the health endpoint. 49 tests, all passing as of 24 Sept.</w:t>
+      </w:r>
+    </w:p>
+    <w:p>
+      <w:pPr>
+        <w:pStyle w:val="Compact"/>
+        <w:numPr>
+          <w:ilvl w:val="0"/>
+          <w:numId w:val="1009"/>
+        </w:numPr>
+      </w:pPr>
+      <w:r>
+        <w:rPr>
+          <w:b/>
+          <w:bCs/>
+        </w:rPr>
+        <w:t xml:space="preserve">Frontend:</w:t>
+      </w:r>
+      <w:r>
+        <w:t xml:space="preserve"> test cases written for authentication, groups, expenses, settlements, recurring expenses, activity and settings (in </w:t>
+      </w:r>
+      <w:r>
+        <w:rPr>
+          <w:rStyle w:val="VerbatimChar"/>
+        </w:rPr>
+        <w:t xml:space="preserve">Documentation/Test Cases</w:t>
+      </w:r>
+      <w:r>
+        <w:t xml:space="preserve">), plus a Cypress e2e test for the authentication page.</w:t>
+      </w:r>
+    </w:p>
+    <w:p>
+      <w:pPr>
+        <w:pStyle w:val="Compact"/>
+        <w:numPr>
+          <w:ilvl w:val="0"/>
+          <w:numId w:val="1009"/>
+        </w:numPr>
+      </w:pPr>
+      <w:r>
+        <w:rPr>
+          <w:b/>
+          <w:bCs/>
+        </w:rPr>
         <w:t xml:space="preserve">Gap:</w:t>
       </w:r>
       <w:r>
-        <w:t xml:space="preserve"> </w:t>
-      </w:r>
-      <w:r>
-        <w:t xml:space="preserve">no backend unit tests yet for the expense-splitting or balance-calculation logic —</w:t>
-      </w:r>
-      <w:r>
-        <w:t xml:space="preserve"> </w:t>
-      </w:r>
-      <w:r>
-        <w:t xml:space="preserve">the highest-risk code (money math) is currently untested.</w:t>
-      </w:r>
-    </w:p>
-    <w:bookmarkEnd w:id="21"/>
-    <w:bookmarkStart w:id="22" w:name="known-gaps"/>
+        <w:t xml:space="preserve"> no Cypress tests yet for the newer features like editing expenses, receipts and the group dashboard.</w:t>
+      </w:r>
+    </w:p>
     <w:p>
       <w:pPr>
         <w:pStyle w:val="Heading2"/>
@@ -1787,7 +1642,7 @@
         </w:numPr>
       </w:pPr>
       <w:r>
-        <w:t xml:space="preserve">Auth/DB host don’t match the SRS (see Section 6).</w:t>
+        <w:t xml:space="preserve">Login and database host are different from the SRS (see Section 6).</w:t>
       </w:r>
     </w:p>
     <w:p>
@@ -1799,13 +1654,7 @@
         </w:numPr>
       </w:pPr>
       <w:r>
-        <w:t xml:space="preserve">Receipt attachments, email notifications, recurring expenses, and activity log are speced</w:t>
-      </w:r>
-      <w:r>
-        <w:t xml:space="preserve"> </w:t>
-      </w:r>
-      <w:r>
-        <w:t xml:space="preserve">but not built.</w:t>
+        <w:t xml:space="preserve">Recurring expenses, email notifications and the activity log are in the SRS but not built.</w:t>
       </w:r>
     </w:p>
     <w:p>
@@ -1817,7 +1666,7 @@
         </w:numPr>
       </w:pPr>
       <w:r>
-        <w:t xml:space="preserve">Expense editing/removal isn’t built yet (create + view only).</w:t>
+        <w:t xml:space="preserve">Percentage splits only save the dollar amount per person, not the percentage. So when you edit one, the percentages are worked out again from the amounts and might be rounded.</w:t>
       </w:r>
     </w:p>
     <w:p>
@@ -1829,7 +1678,7 @@
         </w:numPr>
       </w:pPr>
       <w:r>
-        <w:t xml:space="preserve">No staging/production deployment exists.</w:t>
+        <w:t xml:space="preserve">Only one receipt photo per expense.</w:t>
       </w:r>
     </w:p>
     <w:p>
@@ -1841,7 +1690,7 @@
         </w:numPr>
       </w:pPr>
       <w:r>
-        <w:t xml:space="preserve">Backend test coverage doesn’t reach expense/settlement logic.</w:t>
+        <w:t xml:space="preserve">Not much frontend testing on the newer features (see Section 8).</w:t>
       </w:r>
     </w:p>
     <w:bookmarkEnd w:id="22"/>

</xml_diff>

<commit_message>
Documentation and Presentation done
</commit_message>
<xml_diff>
--- a/AmshShrestha_S394695/Project_Documentation.docx
+++ b/AmshShrestha_S394695/Project_Documentation.docx
@@ -2,6 +2,49 @@
 <file path=word/document.xml><?xml version="1.0" encoding="utf-8"?>
 <w:document xmlns:w="http://schemas.openxmlformats.org/wordprocessingml/2006/main" xmlns:m="http://schemas.openxmlformats.org/officeDocument/2006/math" xmlns:r="http://schemas.openxmlformats.org/officeDocument/2006/relationships" xmlns:o="urn:schemas-microsoft-com:office:office" xmlns:v="urn:schemas-microsoft-com:vml" xmlns:w10="urn:schemas-microsoft-com:office:word" xmlns:a="http://schemas.openxmlformats.org/drawingml/2006/main" xmlns:pic="http://schemas.openxmlformats.org/drawingml/2006/picture" xmlns:wp="http://schemas.openxmlformats.org/drawingml/2006/wordprocessingDrawing">
   <w:body>
+    <w:p>
+      <w:pPr>
+        <w:spacing w:before="0" w:after="0"/>
+        <w:sectPr>
+          <w:pgSz w:w="12240" w:h="15840"/>
+          <w:pgMar w:top="0" w:right="0" w:bottom="0" w:left="0" w:header="0" w:footer="0" w:gutter="0"/>
+        </w:sectPr>
+      </w:pPr>
+      <w:r>
+        <w:drawing>
+          <wp:inline>
+            <wp:extent cx="7772400" cy="10058400"/>
+            <wp:docPr id="10" name="Picture 10"/>
+            <wp:cNvGraphicFramePr>
+              <a:graphicFrameLocks noChangeAspect="1"/>
+            </wp:cNvGraphicFramePr>
+            <a:graphic>
+              <a:graphicData uri="http://schemas.openxmlformats.org/drawingml/2006/picture">
+                <pic:pic>
+                  <pic:nvPicPr>
+                    <pic:cNvPr id="0" name="cover_page.png"/>
+                    <pic:cNvPicPr/>
+                  </pic:nvPicPr>
+                  <pic:blipFill>
+                    <a:blip r:embed="rId18"/>
+                    <a:stretch>
+                      <a:fillRect/>
+                    </a:stretch>
+                  </pic:blipFill>
+                  <pic:spPr>
+                    <a:xfrm>
+                      <a:off x="0" y="0"/>
+                      <a:ext cx="7772400" cy="10058400"/>
+                    </a:xfrm>
+                    <a:prstGeom prst="rect"/>
+                  </pic:spPr>
+                </pic:pic>
+              </a:graphicData>
+            </a:graphic>
+          </wp:inline>
+        </w:drawing>
+      </w:r>
+    </w:p>
     <w:p>
       <w:pPr>
         <w:pStyle w:val="Heading1"/>
@@ -1695,7 +1738,481 @@
     </w:p>
     <w:bookmarkEnd w:id="22"/>
     <w:bookmarkEnd w:id="23"/>
+    <w:p>
+      <w:pPr>
+        <w:pStyle w:val="Heading2"/>
+      </w:pPr>
+      <w:r>
+        <w:t>10. Usage Analytics (Tableau)</w:t>
+      </w:r>
+    </w:p>
+    <w:p>
+      <w:pPr>
+        <w:pStyle w:val="FirstParagraph"/>
+      </w:pPr>
+      <w:r>
+        <w:t>These charts were built from a seeded sample dataset shaped like the app's schema (Jan to Sep 2026), not live production data, since real usage so far is too thin to chart. The data and a Tableau-ready workbook are in AmshShrestha_S394695/week10/charts and AmshShrestha_S394695/week10/xlsx. Two of the charts below (recurring spend and the activity log) model features that are in the SRS but not built yet (see Section 9), included to show what they'd look like once they are.</w:t>
+      </w:r>
+    </w:p>
+    <w:p>
+      <w:pPr>
+        <w:jc w:val="center"/>
+      </w:pPr>
+      <w:r>
+        <w:drawing>
+          <wp:inline>
+            <wp:extent cx="5486400" cy="2237173"/>
+            <wp:docPr id="1" name="Picture 1"/>
+            <wp:cNvGraphicFramePr>
+              <a:graphicFrameLocks noChangeAspect="1"/>
+            </wp:cNvGraphicFramePr>
+            <a:graphic>
+              <a:graphicData uri="http://schemas.openxmlformats.org/drawingml/2006/picture">
+                <pic:pic>
+                  <pic:nvPicPr>
+                    <pic:cNvPr id="0" name="00_kpi_summary.png"/>
+                    <pic:cNvPicPr/>
+                  </pic:nvPicPr>
+                  <pic:blipFill>
+                    <a:blip r:embed="rId9"/>
+                    <a:stretch>
+                      <a:fillRect/>
+                    </a:stretch>
+                  </pic:blipFill>
+                  <pic:spPr>
+                    <a:xfrm>
+                      <a:off x="0" y="0"/>
+                      <a:ext cx="5486400" cy="2237173"/>
+                    </a:xfrm>
+                    <a:prstGeom prst="rect"/>
+                  </pic:spPr>
+                </pic:pic>
+              </a:graphicData>
+            </a:graphic>
+          </wp:inline>
+        </w:drawing>
+      </w:r>
+    </w:p>
+    <w:p>
+      <w:pPr>
+        <w:pStyle w:val="ImageCaption"/>
+        <w:jc w:val="center"/>
+      </w:pPr>
+      <w:r>
+        <w:t>SplitSync at a glance: key totals across the sample period.</w:t>
+      </w:r>
+    </w:p>
+    <w:p>
+      <w:pPr>
+        <w:jc w:val="center"/>
+      </w:pPr>
+      <w:r>
+        <w:drawing>
+          <wp:inline>
+            <wp:extent cx="5486400" cy="3469856"/>
+            <wp:docPr id="2" name="Picture 2"/>
+            <wp:cNvGraphicFramePr>
+              <a:graphicFrameLocks noChangeAspect="1"/>
+            </wp:cNvGraphicFramePr>
+            <a:graphic>
+              <a:graphicData uri="http://schemas.openxmlformats.org/drawingml/2006/picture">
+                <pic:pic>
+                  <pic:nvPicPr>
+                    <pic:cNvPr id="0" name="01_monthly_spend_by_group_type.png"/>
+                    <pic:cNvPicPr/>
+                  </pic:nvPicPr>
+                  <pic:blipFill>
+                    <a:blip r:embed="rId10"/>
+                    <a:stretch>
+                      <a:fillRect/>
+                    </a:stretch>
+                  </pic:blipFill>
+                  <pic:spPr>
+                    <a:xfrm>
+                      <a:off x="0" y="0"/>
+                      <a:ext cx="5486400" cy="3469856"/>
+                    </a:xfrm>
+                    <a:prstGeom prst="rect"/>
+                  </pic:spPr>
+                </pic:pic>
+              </a:graphicData>
+            </a:graphic>
+          </wp:inline>
+        </w:drawing>
+      </w:r>
+    </w:p>
+    <w:p>
+      <w:pPr>
+        <w:pStyle w:val="ImageCaption"/>
+        <w:jc w:val="center"/>
+      </w:pPr>
+      <w:r>
+        <w:t>Monthly spend by group type. June spikes from travel groups.</w:t>
+      </w:r>
+    </w:p>
+    <w:p>
+      <w:pPr>
+        <w:jc w:val="center"/>
+      </w:pPr>
+      <w:r>
+        <w:drawing>
+          <wp:inline>
+            <wp:extent cx="5486400" cy="3554172"/>
+            <wp:docPr id="3" name="Picture 3"/>
+            <wp:cNvGraphicFramePr>
+              <a:graphicFrameLocks noChangeAspect="1"/>
+            </wp:cNvGraphicFramePr>
+            <a:graphic>
+              <a:graphicData uri="http://schemas.openxmlformats.org/drawingml/2006/picture">
+                <pic:pic>
+                  <pic:nvPicPr>
+                    <pic:cNvPr id="0" name="02_spend_by_category.png"/>
+                    <pic:cNvPicPr/>
+                  </pic:nvPicPr>
+                  <pic:blipFill>
+                    <a:blip r:embed="rId11"/>
+                    <a:stretch>
+                      <a:fillRect/>
+                    </a:stretch>
+                  </pic:blipFill>
+                  <pic:spPr>
+                    <a:xfrm>
+                      <a:off x="0" y="0"/>
+                      <a:ext cx="5486400" cy="3554172"/>
+                    </a:xfrm>
+                    <a:prstGeom prst="rect"/>
+                  </pic:spPr>
+                </pic:pic>
+              </a:graphicData>
+            </a:graphic>
+          </wp:inline>
+        </w:drawing>
+      </w:r>
+    </w:p>
+    <w:p>
+      <w:pPr>
+        <w:pStyle w:val="ImageCaption"/>
+        <w:jc w:val="center"/>
+      </w:pPr>
+      <w:r>
+        <w:t>Spend by category, top 10 shown.</w:t>
+      </w:r>
+    </w:p>
+    <w:p>
+      <w:pPr>
+        <w:jc w:val="center"/>
+      </w:pPr>
+      <w:r>
+        <w:drawing>
+          <wp:inline>
+            <wp:extent cx="5486400" cy="2978096"/>
+            <wp:docPr id="4" name="Picture 4"/>
+            <wp:cNvGraphicFramePr>
+              <a:graphicFrameLocks noChangeAspect="1"/>
+            </wp:cNvGraphicFramePr>
+            <a:graphic>
+              <a:graphicData uri="http://schemas.openxmlformats.org/drawingml/2006/picture">
+                <pic:pic>
+                  <pic:nvPicPr>
+                    <pic:cNvPr id="0" name="03_spend_per_group.png"/>
+                    <pic:cNvPicPr/>
+                  </pic:nvPicPr>
+                  <pic:blipFill>
+                    <a:blip r:embed="rId12"/>
+                    <a:stretch>
+                      <a:fillRect/>
+                    </a:stretch>
+                  </pic:blipFill>
+                  <pic:spPr>
+                    <a:xfrm>
+                      <a:off x="0" y="0"/>
+                      <a:ext cx="5486400" cy="2978096"/>
+                    </a:xfrm>
+                    <a:prstGeom prst="rect"/>
+                  </pic:spPr>
+                </pic:pic>
+              </a:graphicData>
+            </a:graphic>
+          </wp:inline>
+        </w:drawing>
+      </w:r>
+    </w:p>
+    <w:p>
+      <w:pPr>
+        <w:pStyle w:val="ImageCaption"/>
+        <w:jc w:val="center"/>
+      </w:pPr>
+      <w:r>
+        <w:t>Total spend per group, with expense count and average.</w:t>
+      </w:r>
+    </w:p>
+    <w:p>
+      <w:pPr>
+        <w:jc w:val="center"/>
+      </w:pPr>
+      <w:r>
+        <w:drawing>
+          <wp:inline>
+            <wp:extent cx="5486400" cy="2544756"/>
+            <wp:docPr id="5" name="Picture 5"/>
+            <wp:cNvGraphicFramePr>
+              <a:graphicFrameLocks noChangeAspect="1"/>
+            </wp:cNvGraphicFramePr>
+            <a:graphic>
+              <a:graphicData uri="http://schemas.openxmlformats.org/drawingml/2006/picture">
+                <pic:pic>
+                  <pic:nvPicPr>
+                    <pic:cNvPr id="0" name="04_split_method_usage.png"/>
+                    <pic:cNvPicPr/>
+                  </pic:nvPicPr>
+                  <pic:blipFill>
+                    <a:blip r:embed="rId13"/>
+                    <a:stretch>
+                      <a:fillRect/>
+                    </a:stretch>
+                  </pic:blipFill>
+                  <pic:spPr>
+                    <a:xfrm>
+                      <a:off x="0" y="0"/>
+                      <a:ext cx="5486400" cy="2544756"/>
+                    </a:xfrm>
+                    <a:prstGeom prst="rect"/>
+                  </pic:spPr>
+                </pic:pic>
+              </a:graphicData>
+            </a:graphic>
+          </wp:inline>
+        </w:drawing>
+      </w:r>
+    </w:p>
+    <w:p>
+      <w:pPr>
+        <w:pStyle w:val="ImageCaption"/>
+        <w:jc w:val="center"/>
+      </w:pPr>
+      <w:r>
+        <w:t>How expenses are split: equal, unequal, or percentage.</w:t>
+      </w:r>
+    </w:p>
+    <w:p>
+      <w:pPr>
+        <w:jc w:val="center"/>
+      </w:pPr>
+      <w:r>
+        <w:drawing>
+          <wp:inline>
+            <wp:extent cx="5486400" cy="2918183"/>
+            <wp:docPr id="6" name="Picture 6"/>
+            <wp:cNvGraphicFramePr>
+              <a:graphicFrameLocks noChangeAspect="1"/>
+            </wp:cNvGraphicFramePr>
+            <a:graphic>
+              <a:graphicData uri="http://schemas.openxmlformats.org/drawingml/2006/picture">
+                <pic:pic>
+                  <pic:nvPicPr>
+                    <pic:cNvPr id="0" name="05_recurring_vs_oneoff.png"/>
+                    <pic:cNvPicPr/>
+                  </pic:nvPicPr>
+                  <pic:blipFill>
+                    <a:blip r:embed="rId14"/>
+                    <a:stretch>
+                      <a:fillRect/>
+                    </a:stretch>
+                  </pic:blipFill>
+                  <pic:spPr>
+                    <a:xfrm>
+                      <a:off x="0" y="0"/>
+                      <a:ext cx="5486400" cy="2918183"/>
+                    </a:xfrm>
+                    <a:prstGeom prst="rect"/>
+                  </pic:spPr>
+                </pic:pic>
+              </a:graphicData>
+            </a:graphic>
+          </wp:inline>
+        </w:drawing>
+      </w:r>
+    </w:p>
+    <w:p>
+      <w:pPr>
+        <w:pStyle w:val="ImageCaption"/>
+        <w:jc w:val="center"/>
+      </w:pPr>
+      <w:r>
+        <w:t>Recurring vs one-off spend per group. Models the recurring-expenses feature from the SRS, which isn't built yet (Section 9).</w:t>
+      </w:r>
+    </w:p>
+    <w:p>
+      <w:pPr>
+        <w:jc w:val="center"/>
+      </w:pPr>
+      <w:r>
+        <w:drawing>
+          <wp:inline>
+            <wp:extent cx="5486400" cy="4979839"/>
+            <wp:docPr id="7" name="Picture 7"/>
+            <wp:cNvGraphicFramePr>
+              <a:graphicFrameLocks noChangeAspect="1"/>
+            </wp:cNvGraphicFramePr>
+            <a:graphic>
+              <a:graphicData uri="http://schemas.openxmlformats.org/drawingml/2006/picture">
+                <pic:pic>
+                  <pic:nvPicPr>
+                    <pic:cNvPr id="0" name="06_unsettled_balances.png"/>
+                    <pic:cNvPicPr/>
+                  </pic:nvPicPr>
+                  <pic:blipFill>
+                    <a:blip r:embed="rId15"/>
+                    <a:stretch>
+                      <a:fillRect/>
+                    </a:stretch>
+                  </pic:blipFill>
+                  <pic:spPr>
+                    <a:xfrm>
+                      <a:off x="0" y="0"/>
+                      <a:ext cx="5486400" cy="4979839"/>
+                    </a:xfrm>
+                    <a:prstGeom prst="rect"/>
+                  </pic:spPr>
+                </pic:pic>
+              </a:graphicData>
+            </a:graphic>
+          </wp:inline>
+        </w:drawing>
+      </w:r>
+    </w:p>
+    <w:p>
+      <w:pPr>
+        <w:pStyle w:val="ImageCaption"/>
+        <w:jc w:val="center"/>
+      </w:pPr>
+      <w:r>
+        <w:t>Unsettled balance per member, who owes who across all groups.</w:t>
+      </w:r>
+    </w:p>
+    <w:p>
+      <w:pPr>
+        <w:jc w:val="center"/>
+      </w:pPr>
+      <w:r>
+        <w:drawing>
+          <wp:inline>
+            <wp:extent cx="5486400" cy="3367716"/>
+            <wp:docPr id="8" name="Picture 8"/>
+            <wp:cNvGraphicFramePr>
+              <a:graphicFrameLocks noChangeAspect="1"/>
+            </wp:cNvGraphicFramePr>
+            <a:graphic>
+              <a:graphicData uri="http://schemas.openxmlformats.org/drawingml/2006/picture">
+                <pic:pic>
+                  <pic:nvPicPr>
+                    <pic:cNvPr id="0" name="07_activity_per_month.png"/>
+                    <pic:cNvPicPr/>
+                  </pic:nvPicPr>
+                  <pic:blipFill>
+                    <a:blip r:embed="rId16"/>
+                    <a:stretch>
+                      <a:fillRect/>
+                    </a:stretch>
+                  </pic:blipFill>
+                  <pic:spPr>
+                    <a:xfrm>
+                      <a:off x="0" y="0"/>
+                      <a:ext cx="5486400" cy="3367716"/>
+                    </a:xfrm>
+                    <a:prstGeom prst="rect"/>
+                  </pic:spPr>
+                </pic:pic>
+              </a:graphicData>
+            </a:graphic>
+          </wp:inline>
+        </w:drawing>
+      </w:r>
+    </w:p>
+    <w:p>
+      <w:pPr>
+        <w:pStyle w:val="ImageCaption"/>
+        <w:jc w:val="center"/>
+      </w:pPr>
+      <w:r>
+        <w:t>App activity per month by event type. Models the activity log from the SRS, which isn't built yet (Section 9).</w:t>
+      </w:r>
+    </w:p>
+    <w:p>
+      <w:pPr>
+        <w:jc w:val="center"/>
+      </w:pPr>
+      <w:r>
+        <w:drawing>
+          <wp:inline>
+            <wp:extent cx="5486400" cy="2833784"/>
+            <wp:docPr id="9" name="Picture 9"/>
+            <wp:cNvGraphicFramePr>
+              <a:graphicFrameLocks noChangeAspect="1"/>
+            </wp:cNvGraphicFramePr>
+            <a:graphic>
+              <a:graphicData uri="http://schemas.openxmlformats.org/drawingml/2006/picture">
+                <pic:pic>
+                  <pic:nvPicPr>
+                    <pic:cNvPr id="0" name="08_receipt_rate_per_group.png"/>
+                    <pic:cNvPicPr/>
+                  </pic:nvPicPr>
+                  <pic:blipFill>
+                    <a:blip r:embed="rId17"/>
+                    <a:stretch>
+                      <a:fillRect/>
+                    </a:stretch>
+                  </pic:blipFill>
+                  <pic:spPr>
+                    <a:xfrm>
+                      <a:off x="0" y="0"/>
+                      <a:ext cx="5486400" cy="2833784"/>
+                    </a:xfrm>
+                    <a:prstGeom prst="rect"/>
+                  </pic:spPr>
+                </pic:pic>
+              </a:graphicData>
+            </a:graphic>
+          </wp:inline>
+        </w:drawing>
+      </w:r>
+    </w:p>
+    <w:p>
+      <w:pPr>
+        <w:pStyle w:val="ImageCaption"/>
+        <w:jc w:val="center"/>
+      </w:pPr>
+      <w:r>
+        <w:t>Share of expenses with a receipt photo attached, per group.</w:t>
+      </w:r>
+    </w:p>
+    <w:p>
+      <w:pPr>
+        <w:pStyle w:val="Heading2"/>
+      </w:pPr>
+      <w:r>
+        <w:t>11. Conclusion</w:t>
+      </w:r>
+    </w:p>
+    <w:p>
+      <w:pPr>
+        <w:pStyle w:val="FirstParagraph"/>
+      </w:pPr>
+      <w:r>
+        <w:t>SplitSync meets the aim and objectives from Section 2 and 3. Groups, expense splitting (equal, unequal, percentage), balances, settlements, notifications, receipt photos, and editing/deleting an expense are all built and working, which covers the core of what the SRS asked for. Recurring expenses and the activity log are the two SRS features that didn't make it in, and the newer features (editing, receipts, the group dashboard) still need more frontend test coverage, both already listed in Section 9.</w:t>
+      </w:r>
+    </w:p>
+    <w:p>
+      <w:pPr>
+        <w:pStyle w:val="FirstParagraph"/>
+      </w:pPr>
+      <w:r>
+        <w:t>The app is set up to deploy on Render (Dockerfile and render.yaml in splitsync/), with CORS, environment based secrets, and migrations that run automatically on startup. What's left before final submission is running through that deployment, a full QA pass against the live build, and writing up the remaining report sections (see the Trello board for the up to date task list).</w:t>
+      </w:r>
+    </w:p>
     <w:sectPr>
+      <w:pgSz w:w="12240" w:h="15840"/>
+      <w:pgMar w:top="1440" w:right="1440" w:bottom="1440" w:left="1440" w:header="720" w:footer="720" w:gutter="0"/>
       <w:footnotePr>
         <w:numRestart w:val="eachSect"/>
       </w:footnotePr>

</xml_diff>